<commit_message>
A I suppose you're all wondering why I invited you here.
</commit_message>
<xml_diff>
--- a/Chapter 10 - Armour.docx
+++ b/Chapter 10 - Armour.docx
@@ -9,7 +9,10 @@
     </w:p>
     <w:p>
       <w:r>
-        <w:t>It was a long sigh. “Jesus Ernie, you’ve been there ten minutes.”</w:t>
+        <w:t>There was a sigh from Pausing - i</w:t>
+      </w:r>
+      <w:r>
+        <w:t>t was a long sigh. “Jesus Ernie, you’ve been there ten minutes.”</w:t>
       </w:r>
     </w:p>
     <w:p>
@@ -54,7 +57,15 @@
     <w:p/>
     <w:p>
       <w:r>
-        <w:t xml:space="preserve">“Mr Pausing assured me that you’re the best man for the job. And that paying you to stay in my uncle’s house is the best way of keeping it, and </w:t>
+        <w:t>“</w:t>
+      </w:r>
+      <w:proofErr w:type="spellStart"/>
+      <w:r>
+        <w:t>Mr</w:t>
+      </w:r>
+      <w:proofErr w:type="spellEnd"/>
+      <w:r>
+        <w:t xml:space="preserve"> Pausing assured me that you’re the best man for the job. And that paying you to stay in my uncle’s house is the best way of keeping it, and </w:t>
       </w:r>
       <w:proofErr w:type="gramStart"/>
       <w:r>
@@ -62,7 +73,15 @@
       </w:r>
       <w:proofErr w:type="gramEnd"/>
       <w:r>
-        <w:t xml:space="preserve"> its things safe Mr Klee”</w:t>
+        <w:t xml:space="preserve"> its things safe </w:t>
+      </w:r>
+      <w:proofErr w:type="spellStart"/>
+      <w:r>
+        <w:t>Mr</w:t>
+      </w:r>
+      <w:proofErr w:type="spellEnd"/>
+      <w:r>
+        <w:t xml:space="preserve"> Klee”</w:t>
       </w:r>
       <w:r>
         <w:br/>
@@ -71,12 +90,32 @@
     </w:p>
     <w:p>
       <w:r>
-        <w:t>“But now, I hear that on the first day, that my uncle’s house has been burglarised – in broad daylight.”</w:t>
-      </w:r>
-    </w:p>
-    <w:p>
-      <w:r>
-        <w:t xml:space="preserve">Clients. That was one thing at least about being a copper. You didn’t really have clients. Well, when you were on the murder squad. There was this idea I suppose that you were avenging the death of the victim. And so, you </w:t>
+        <w:t xml:space="preserve">“But now, I hear on the first day, that my uncle’s house has been </w:t>
+      </w:r>
+      <w:proofErr w:type="spellStart"/>
+      <w:r>
+        <w:t>burglarised</w:t>
+      </w:r>
+      <w:proofErr w:type="spellEnd"/>
+      <w:r>
+        <w:t xml:space="preserve"> – in broad daylight.”</w:t>
+      </w:r>
+    </w:p>
+    <w:p>
+      <w:r>
+        <w:t>Clients. That was one thing at least about being a copper. You didn’t really have clients. Well, when you were on the murder squad</w:t>
+      </w:r>
+      <w:r>
+        <w:t>,</w:t>
+      </w:r>
+      <w:r>
+        <w:t xml:space="preserve"> </w:t>
+      </w:r>
+      <w:r>
+        <w:t>t</w:t>
+      </w:r>
+      <w:r>
+        <w:t xml:space="preserve">here was this idea I suppose that you were avenging the death of the victim. And so, you </w:t>
       </w:r>
       <w:proofErr w:type="gramStart"/>
       <w:r>
@@ -132,10 +171,34 @@
         <w:t xml:space="preserve"> that?</w:t>
       </w:r>
       <w:r>
-        <w:t xml:space="preserve"> Pronounced “Turps – ick – o’ree!”</w:t>
-      </w:r>
-      <w:r>
-        <w:t xml:space="preserve"> When you spelled it out like that, it sounded like the name of a cartoon leprechaun. Anyway. Mr T </w:t>
+        <w:t xml:space="preserve"> Pronounced “</w:t>
+      </w:r>
+      <w:proofErr w:type="spellStart"/>
+      <w:r>
+        <w:t>Turps</w:t>
+      </w:r>
+      <w:proofErr w:type="spellEnd"/>
+      <w:r>
+        <w:t xml:space="preserve"> – ick – </w:t>
+      </w:r>
+      <w:proofErr w:type="spellStart"/>
+      <w:r>
+        <w:t>o’ree</w:t>
+      </w:r>
+      <w:proofErr w:type="spellEnd"/>
+      <w:r>
+        <w:t>!”</w:t>
+      </w:r>
+      <w:r>
+        <w:t xml:space="preserve"> When you spelled it out like that, it sounded like the name of a cartoon leprechaun. Anyway. </w:t>
+      </w:r>
+      <w:proofErr w:type="spellStart"/>
+      <w:r>
+        <w:t>Mr</w:t>
+      </w:r>
+      <w:proofErr w:type="spellEnd"/>
+      <w:r>
+        <w:t xml:space="preserve"> T </w:t>
       </w:r>
       <w:r>
         <w:t>was a client</w:t>
@@ -170,7 +233,23 @@
     </w:p>
     <w:p>
       <w:r>
-        <w:t>“I understand Mr Terpsichore, it is very disappointing. I was talking with Mr Pausing. And he thought that it might be better if I talked to you personally.”</w:t>
+        <w:t xml:space="preserve">“I understand </w:t>
+      </w:r>
+      <w:proofErr w:type="spellStart"/>
+      <w:r>
+        <w:t>Mr</w:t>
+      </w:r>
+      <w:proofErr w:type="spellEnd"/>
+      <w:r>
+        <w:t xml:space="preserve"> Terpsichore, it is very disappointing. I was talking with </w:t>
+      </w:r>
+      <w:proofErr w:type="spellStart"/>
+      <w:r>
+        <w:t>Mr</w:t>
+      </w:r>
+      <w:proofErr w:type="spellEnd"/>
+      <w:r>
+        <w:t xml:space="preserve"> Pausing. And he thought that it might be better if I talked to you personally.”</w:t>
       </w:r>
     </w:p>
     <w:p>
@@ -223,7 +302,15 @@
     </w:p>
     <w:p>
       <w:r>
-        <w:t xml:space="preserve">Terpsichore looked frail. Klee realised that he must be about the same age as him. </w:t>
+        <w:t xml:space="preserve">Terpsichore looked frail. Klee </w:t>
+      </w:r>
+      <w:proofErr w:type="spellStart"/>
+      <w:r>
+        <w:t>realised</w:t>
+      </w:r>
+      <w:proofErr w:type="spellEnd"/>
+      <w:r>
+        <w:t xml:space="preserve"> that he must be about the same age as him. </w:t>
       </w:r>
       <w:r>
         <w:t>Te</w:t>
@@ -241,7 +328,15 @@
       </w:r>
       <w:r>
         <w:lastRenderedPageBreak/>
-        <w:t xml:space="preserve">symmetrical, neutral expression. He was wearing a business suit and a tie. On his top half, anyway, who knew what anyone was wearing under the desk these days. Wet suit? Stockings and suspenders – suit – of armour? Klee’s thoughts were drifting, wondering if ordinary </w:t>
+        <w:t xml:space="preserve">symmetrical, neutral expression. He was wearing a business suit and a tie. On his top half, anyway, who knew what anyone was wearing under the desk these days. Wet suit? Stockings and suspenders – suit – of </w:t>
+      </w:r>
+      <w:proofErr w:type="spellStart"/>
+      <w:r>
+        <w:t>armour</w:t>
+      </w:r>
+      <w:proofErr w:type="spellEnd"/>
+      <w:r>
+        <w:t xml:space="preserve">? Klee’s thoughts were drifting, wondering if ordinary </w:t>
       </w:r>
       <w:r>
         <w:t>c</w:t>
@@ -253,7 +348,15 @@
     <w:p>
       <w:r>
         <w:br/>
-        <w:t>“Mr Pausing said that he’d leave that to your judgement, and of course, if there were insurance, involved</w:t>
+        <w:t>“</w:t>
+      </w:r>
+      <w:proofErr w:type="spellStart"/>
+      <w:r>
+        <w:t>Mr</w:t>
+      </w:r>
+      <w:proofErr w:type="spellEnd"/>
+      <w:r>
+        <w:t xml:space="preserve"> Pausing said that he’d leave that to your judgement, and of course, if there were insurance, involved</w:t>
       </w:r>
       <w:r>
         <w:t xml:space="preserve"> and we wanted to claim we’d need to. </w:t>
@@ -287,7 +390,15 @@
       </w:r>
       <w:r>
         <w:br/>
-        <w:t>“I wish it were the case that the police would pursue a matter like this Mr Terpsichore, but having been a policeman myself, I’m afraid, that all we’d really get out of the process is a crime report number.”</w:t>
+        <w:t xml:space="preserve">“I wish it were the case that the police would pursue a matter like this </w:t>
+      </w:r>
+      <w:proofErr w:type="spellStart"/>
+      <w:r>
+        <w:t>Mr</w:t>
+      </w:r>
+      <w:proofErr w:type="spellEnd"/>
+      <w:r>
+        <w:t xml:space="preserve"> Terpsichore, but having been a policeman myself, I’m afraid, that all we’d really get out of the process is a crime report number.”</w:t>
       </w:r>
     </w:p>
     <w:p/>
@@ -309,7 +420,15 @@
       </w:r>
       <w:r>
         <w:br/>
-        <w:t xml:space="preserve">“I have an associate. Who specialises in securing,” - a pause – “addresses” – he was going to say crime scenes, murder scenes. </w:t>
+        <w:t xml:space="preserve">“I have an associate. Who </w:t>
+      </w:r>
+      <w:proofErr w:type="spellStart"/>
+      <w:r>
+        <w:t>specialises</w:t>
+      </w:r>
+      <w:proofErr w:type="spellEnd"/>
+      <w:r>
+        <w:t xml:space="preserve"> in securing,” - a pause – “addresses” – he was going to say crime scenes, murder scenes. </w:t>
       </w:r>
     </w:p>
     <w:p>
@@ -342,13 +461,13 @@
       </w:r>
       <w:proofErr w:type="gramEnd"/>
       <w:r>
-        <w:t xml:space="preserve"> circumstances, that would be very</w:t>
-      </w:r>
-      <w:r>
-        <w:t xml:space="preserve"> a</w:t>
-      </w:r>
-      <w:r>
-        <w:t xml:space="preserve"> good idea. What kind of thing would this involve.”</w:t>
+        <w:t xml:space="preserve"> circumstances, that would be </w:t>
+      </w:r>
+      <w:r>
+        <w:t xml:space="preserve">a </w:t>
+      </w:r>
+      <w:r>
+        <w:t>very good idea. What kind of thing would this involve.”</w:t>
       </w:r>
       <w:r>
         <w:br/>
@@ -382,7 +501,15 @@
     </w:p>
     <w:p>
       <w:r>
-        <w:t xml:space="preserve">But Klee didn’t have to put together a justification for why Mr Topsy Turvey – oh Jesus, he couldn’t let that stick, or he’d never remember the real name. Because before he managed to say anything else, </w:t>
+        <w:t xml:space="preserve">But Klee didn’t have to put together a justification for why </w:t>
+      </w:r>
+      <w:proofErr w:type="spellStart"/>
+      <w:r>
+        <w:t>Mr</w:t>
+      </w:r>
+      <w:proofErr w:type="spellEnd"/>
+      <w:r>
+        <w:t xml:space="preserve"> Topsy Turvey – oh Jesus, he couldn’t let that stick, or he’d never remember the real name. Because before he managed to say anything else, </w:t>
       </w:r>
       <w:r>
         <w:t xml:space="preserve">Terpsichore interrupted. </w:t>
@@ -390,7 +517,15 @@
     </w:p>
     <w:p>
       <w:r>
-        <w:t>“My apologies Mr Klee, it’s the nature of my business to have to deal with aggressive and confrontational people all day long. And the temptation is to become</w:t>
+        <w:t xml:space="preserve">“My apologies </w:t>
+      </w:r>
+      <w:proofErr w:type="spellStart"/>
+      <w:r>
+        <w:t>Mr</w:t>
+      </w:r>
+      <w:proofErr w:type="spellEnd"/>
+      <w:r>
+        <w:t xml:space="preserve"> Klee, it’s the nature of my business to have to deal with aggressive and confrontational people all day long. And the temptation is to become</w:t>
       </w:r>
       <w:r>
         <w:t xml:space="preserve"> – well,</w:t>
@@ -430,21 +565,33 @@
     </w:p>
     <w:p>
       <w:r>
-        <w:t xml:space="preserve">Klee was very glad that he hadn’t been asked to justify his presence. Because wasn’t sure that he would </w:t>
-      </w:r>
-      <w:proofErr w:type="gramStart"/>
-      <w:r>
-        <w:t>have been</w:t>
-      </w:r>
-      <w:proofErr w:type="gramEnd"/>
-      <w:r>
-        <w:t xml:space="preserve"> able to. </w:t>
+        <w:t xml:space="preserve">Klee was very glad that he hadn’t been asked to justify his presence. Because </w:t>
+      </w:r>
+      <w:r>
+        <w:t xml:space="preserve">he </w:t>
+      </w:r>
+      <w:r>
+        <w:t xml:space="preserve">wasn’t sure that he would have been able to. </w:t>
       </w:r>
     </w:p>
     <w:p/>
     <w:p>
       <w:r>
-        <w:t>But then he’d started to get worried that “Turps” was going to start sharing his domestic problems. And that was something he hardly ever wanted any</w:t>
+        <w:t>But then he’d started to get worried that “</w:t>
+      </w:r>
+      <w:proofErr w:type="spellStart"/>
+      <w:r>
+        <w:t>Turps</w:t>
+      </w:r>
+      <w:proofErr w:type="spellEnd"/>
+      <w:r>
+        <w:t xml:space="preserve">” was going to </w:t>
+      </w:r>
+      <w:r>
+        <w:t xml:space="preserve">share </w:t>
+      </w:r>
+      <w:r>
+        <w:t>his domestic problems. And that was something he hardly ever wanted any</w:t>
       </w:r>
       <w:r>
         <w:t>body</w:t>
@@ -476,11 +623,65 @@
       </w:r>
       <w:r>
         <w:br/>
-        <w:t>“Oh Mr Klee”</w:t>
-      </w:r>
-      <w:r>
-        <w:br/>
-        <w:t>“Yes, Mr Turps” he realised that might not be a great idea just calling him that in his head  “– ick – O’ree?” he finished.</w:t>
+        <w:t xml:space="preserve">“Oh </w:t>
+      </w:r>
+      <w:proofErr w:type="spellStart"/>
+      <w:r>
+        <w:t>Mr</w:t>
+      </w:r>
+      <w:proofErr w:type="spellEnd"/>
+      <w:r>
+        <w:t xml:space="preserve"> Klee</w:t>
+      </w:r>
+      <w:r>
+        <w:t>?</w:t>
+      </w:r>
+      <w:r>
+        <w:t>”</w:t>
+      </w:r>
+      <w:r>
+        <w:br/>
+        <w:t xml:space="preserve">“Yes, </w:t>
+      </w:r>
+      <w:proofErr w:type="spellStart"/>
+      <w:r>
+        <w:t>Mr</w:t>
+      </w:r>
+      <w:proofErr w:type="spellEnd"/>
+      <w:r>
+        <w:t xml:space="preserve"> </w:t>
+      </w:r>
+      <w:proofErr w:type="spellStart"/>
+      <w:r>
+        <w:t>Turps</w:t>
+      </w:r>
+      <w:proofErr w:type="spellEnd"/>
+      <w:r>
+        <w:t xml:space="preserve">” he </w:t>
+      </w:r>
+      <w:proofErr w:type="spellStart"/>
+      <w:r>
+        <w:t>realised</w:t>
+      </w:r>
+      <w:proofErr w:type="spellEnd"/>
+      <w:r>
+        <w:t xml:space="preserve"> that might not be a great idea just calling him that in his </w:t>
+      </w:r>
+      <w:proofErr w:type="gramStart"/>
+      <w:r>
+        <w:t>head  “</w:t>
+      </w:r>
+      <w:proofErr w:type="gramEnd"/>
+      <w:r>
+        <w:t xml:space="preserve">– ick – </w:t>
+      </w:r>
+      <w:proofErr w:type="spellStart"/>
+      <w:r>
+        <w:t>O’ree</w:t>
+      </w:r>
+      <w:proofErr w:type="spellEnd"/>
+      <w:r>
+        <w:t>?” he finished.</w:t>
       </w:r>
       <w:r>
         <w:br/>
@@ -511,7 +712,15 @@
         <w:t xml:space="preserve"> just his</w:t>
       </w:r>
       <w:r>
-        <w:t xml:space="preserve"> pants, or in a wet suit. Or a suit of armour.</w:t>
+        <w:t xml:space="preserve"> pants, or in a wet suit. Or a suit of </w:t>
+      </w:r>
+      <w:proofErr w:type="spellStart"/>
+      <w:r>
+        <w:t>armour</w:t>
+      </w:r>
+      <w:proofErr w:type="spellEnd"/>
+      <w:r>
+        <w:t>.</w:t>
       </w:r>
       <w:r>
         <w:br/>

</xml_diff>